<commit_message>
Regenerate resume DOCX/PDF from ask_short.json
Root outputs rebuilt with the repo generator (make build flow)
from the synced ask_short.json source.
</commit_message>
<xml_diff>
--- a/Saravanakumar_Arunachalam_Resume.docx
+++ b/Saravanakumar_Arunachalam_Resume.docx
@@ -12,7 +12,7 @@
     </w:p>
     <w:p>
       <w:r>
-        <w:t>Charlotte, NC | +1 214-713-5765</w:t>
+        <w:t>Charlotte, NC | +1 214-713-5765 | saravanastar@gmail.com</w:t>
       </w:r>
     </w:p>
     <w:p>
@@ -40,7 +40,7 @@
     </w:p>
     <w:p>
       <w:r>
-        <w:t>Software and platform engineer with 14+ years of experience in cloud-native, microservices, and event-driven systems. Strong hands-on experience with Java, Go, Python, Spring Boot, Kubernetes, AWS, Terraform, and Helm. Currently a Senior Platform Engineer at GEICO in Charlotte, working in a hybrid setup on Kubernetes-native infrastructure, serverless platforms, AI infrastructure, and production operations. Experienced in observability, CI/CD, GitOps, SRE practices, and building scalable systems with Knative, Istio, KEDA, Kafka, Grafana, and Loki.</w:t>
+        <w:t>Backend-focused Software Engineer with 15+ years of experience designing and building highly available, reliable, and resilient distributed systems. Specialized in Golang, Java, and Python for backend platforms, APIs, and large-scale event-driven data pipelines. Proven expertise in designing architectures that ensure system stability, scalability, and observability. Strong hands-on experience with cloud-native technologies (AWS, Azure, Kubernetes), infrastructure automation (Terraform, Helm), and observability stacks (Grafana, Prometheus, Loki). Currently a Senior Platform Engineer at GEICO in Charlotte, building and leading end-to-end delivery of Kubernetes-native AI infrastructure — RAG pipelines, autoscaled LLM inference, and agentic AI patterns. Passionate about solving complex challenges in data-intensive environments while maintaining high performance and operational excellence.</w:t>
       </w:r>
     </w:p>
     <w:p>
@@ -56,10 +56,32 @@
         <w:rPr>
           <w:b/>
         </w:rPr>
-        <w:t>Backend Development:</w:t>
+        <w:t>AI/ML &amp; GenAI:</w:t>
       </w:r>
       <w:r>
-        <w:t xml:space="preserve"> Java, Go, Python, NodeJS, Spring, Microservices, Event-Driven Design, gRPC, Protobuf</w:t>
+        <w:t xml:space="preserve"> RAG Pipelines, LLM Inference &amp; Serving, Agentic AI Patterns, Vector Databases &amp; Embeddings, Prompt Engineering, Triton Inference Server, KEDA GPU Autoscaling, LLMOps, Model Deployment &amp; Monitoring</w:t>
+      </w:r>
+    </w:p>
+    <w:p>
+      <w:r>
+        <w:rPr>
+          <w:b/>
+        </w:rPr>
+        <w:t>Backend &amp; Distributed Systems:</w:t>
+      </w:r>
+      <w:r>
+        <w:t xml:space="preserve"> Golang, Java, Python, Spring Boot, REST, gRPC, Microservices, System Design</w:t>
+      </w:r>
+    </w:p>
+    <w:p>
+      <w:r>
+        <w:rPr>
+          <w:b/>
+        </w:rPr>
+        <w:t>Data &amp; Streaming:</w:t>
+      </w:r>
+      <w:r>
+        <w:t xml:space="preserve"> Kafka, Kinesis, Pub/Sub, Flink, Event-Driven Architecture, High-Throughput Pipelines, Stream Processing, Real-time Analytics</w:t>
       </w:r>
     </w:p>
     <w:p>
@@ -70,29 +92,7 @@
         <w:t>Cloud &amp; DevOps:</w:t>
       </w:r>
       <w:r>
-        <w:t xml:space="preserve"> AWS, Kubernetes, Docker, Terraform, Helm, CloudFormation, AWS CDK, Knative, KEDA, Istio, cert-manager, Cloud Foundry (PCF), ECS, EC2, Lambda, SQS, SNS</w:t>
-      </w:r>
-    </w:p>
-    <w:p>
-      <w:r>
-        <w:rPr>
-          <w:b/>
-        </w:rPr>
-        <w:t>Streaming &amp; Messaging:</w:t>
-      </w:r>
-      <w:r>
-        <w:t xml:space="preserve"> Kafka, Kinesis, SQS, SNS, Flink</w:t>
-      </w:r>
-    </w:p>
-    <w:p>
-      <w:r>
-        <w:rPr>
-          <w:b/>
-        </w:rPr>
-        <w:t>Frontend Development:</w:t>
-      </w:r>
-      <w:r>
-        <w:t xml:space="preserve"> HTML, CSS, JavaScript, TypeScript, Angular, React.js, Servlets, JSP</w:t>
+        <w:t xml:space="preserve"> AWS, Azure, Kubernetes, Docker, Terraform, Helm, Jenkins, CloudFormation, Knative, KEDA, Istio, Service Mesh</w:t>
       </w:r>
     </w:p>
     <w:p>
@@ -103,7 +103,7 @@
         <w:t>Databases &amp; Storage:</w:t>
       </w:r>
       <w:r>
-        <w:t xml:space="preserve"> Oracle, Postgres, MySQL, MongoDB, ElasticSearch, DynamoDB, S3, Distributed Cache</w:t>
+        <w:t xml:space="preserve"> Postgres, MySQL, Oracle, MongoDB, DynamoDB, ElasticSearch, S3</w:t>
       </w:r>
     </w:p>
     <w:p>
@@ -111,10 +111,10 @@
         <w:rPr>
           <w:b/>
         </w:rPr>
-        <w:t>Design &amp; Architecture:</w:t>
+        <w:t>Reliability &amp; Observability:</w:t>
       </w:r>
       <w:r>
-        <w:t xml:space="preserve"> DDD, CQRS, Circuit Breaker, Saga, Distributed Systems, Netflix OSS (Eureka, Hystrix, Feign, Ribbon, Zuul)</w:t>
+        <w:t xml:space="preserve"> Grafana, Prometheus, Loki, Jaeger, SRE, Resilience Engineering, High Availability, Fault Tolerance, BCDR</w:t>
       </w:r>
     </w:p>
     <w:p>
@@ -122,10 +122,10 @@
         <w:rPr>
           <w:b/>
         </w:rPr>
-        <w:t>Development Practices:</w:t>
+        <w:t>Leadership &amp; Delivery:</w:t>
       </w:r>
       <w:r>
-        <w:t xml:space="preserve"> SOLID, TDD, Pair Programming, Agile (Scrum/Kanban), GitOps, CI/CD, Infrastructure as Code</w:t>
+        <w:t xml:space="preserve"> Technical Leadership, Project Leadership, Team Mentoring, Cross-functional Collaboration, Stakeholder Management, Agile (Scrum/Kanban)</w:t>
       </w:r>
     </w:p>
     <w:p>
@@ -133,21 +133,10 @@
         <w:rPr>
           <w:b/>
         </w:rPr>
-        <w:t>Observability &amp; Monitoring:</w:t>
+        <w:t>Architecture &amp; Practices:</w:t>
       </w:r>
       <w:r>
-        <w:t xml:space="preserve"> Grafana, Loki, Splunk, OpenSearch, Telemetry, Monitoring</w:t>
-      </w:r>
-    </w:p>
-    <w:p>
-      <w:r>
-        <w:rPr>
-          <w:b/>
-        </w:rPr>
-        <w:t>Languages:</w:t>
-      </w:r>
-      <w:r>
-        <w:t xml:space="preserve"> English (Professional Working), Tamil (Native or Bilingual)</w:t>
+        <w:t xml:space="preserve"> Distributed Systems, CQRS, DDD, Scalability, TDD, CI/CD</w:t>
       </w:r>
     </w:p>
     <w:p>
@@ -163,7 +152,7 @@
         <w:pStyle w:val="Heading3"/>
       </w:pPr>
       <w:r>
-        <w:t>Senior Platform Engineer – GEICO</w:t>
+        <w:t>Senior Platform Engineer – Geico</w:t>
       </w:r>
     </w:p>
     <w:p>
@@ -176,7 +165,7 @@
         <w:pStyle w:val="ListBullet"/>
       </w:pPr>
       <w:r>
-        <w:t>Designed and built a highly available serverless platform on Kubernetes using Knative, KEDA, Istio service mesh, and cert-manager</w:t>
+        <w:t>Leading end-to-end design, build, and delivery of AI platform initiatives — owning architecture, implementation, and production operations for RAG pipelines, autoscaled inference, and agentic AI workloads.</w:t>
       </w:r>
     </w:p>
     <w:p>
@@ -184,7 +173,7 @@
         <w:pStyle w:val="ListBullet"/>
       </w:pPr>
       <w:r>
-        <w:t>Implemented observability with Grafana, Loki, and telemetry tooling to monitor system health and service reliability</w:t>
+        <w:t>Architected and developed a serverless platform with high availability, stability, and resilience on Kubernetes.</w:t>
       </w:r>
     </w:p>
     <w:p>
@@ -192,7 +181,7 @@
         <w:pStyle w:val="ListBullet"/>
       </w:pPr>
       <w:r>
-        <w:t>Managed Kubernetes infrastructure with Helm and ArgoCD for declarative GitOps-based continuous delivery</w:t>
+        <w:t>Designed and implemented BCDR (Business Continuity and Disaster Recovery) strategies, including data replication and failover mechanisms.</w:t>
       </w:r>
     </w:p>
     <w:p>
@@ -200,7 +189,7 @@
         <w:pStyle w:val="ListBullet"/>
       </w:pPr>
       <w:r>
-        <w:t>Built and operated Kubernetes-native production workloads, including Knative services, Istio traffic management, KEDA autoscaling, and Kafka pipelines</w:t>
+        <w:t>Integrated observability stack (Grafana, Prometheus, Loki) to ensure proactive monitoring and operational reliability.</w:t>
       </w:r>
     </w:p>
     <w:p>
@@ -208,7 +197,7 @@
         <w:pStyle w:val="ListBullet"/>
       </w:pPr>
       <w:r>
-        <w:t>Developed AI infrastructure for RAG pipelines on Kubernetes, autoscaled inference workloads, and agentic AI patterns</w:t>
+        <w:t>Delivered scalable CaaS/FaaS solutions leveraging Knative, KEDA, and Istio.</w:t>
       </w:r>
     </w:p>
     <w:p>
@@ -216,7 +205,20 @@
         <w:pStyle w:val="ListBullet"/>
       </w:pPr>
       <w:r>
-        <w:t>Partnered with product managers and stakeholders to define architecture requirements and technical roadmaps</w:t>
+        <w:t>Built Kubernetes-native infrastructure for production workloads, including Kafka pipelines, RAG pipelines, autoscaled inference, and agentic AI patterns.</w:t>
+      </w:r>
+    </w:p>
+    <w:p>
+      <w:pPr>
+        <w:pStyle w:val="Heading3"/>
+      </w:pPr>
+      <w:r>
+        <w:t>Senior Software Engineer – Fidelity Investments (Contract)</w:t>
+      </w:r>
+    </w:p>
+    <w:p>
+      <w:r>
+        <w:t>Remote | Apr 2024 – Jun 2024</w:t>
       </w:r>
     </w:p>
     <w:p>
@@ -224,7 +226,23 @@
         <w:pStyle w:val="ListBullet"/>
       </w:pPr>
       <w:r>
-        <w:t>Owned operational health through on-call support, incident response, and resilience-focused engineering</w:t>
+        <w:t>Developed resilient backend services in Golang to support high-frequency trading and cryptocurrency workflows.</w:t>
+      </w:r>
+    </w:p>
+    <w:p>
+      <w:pPr>
+        <w:pStyle w:val="ListBullet"/>
+      </w:pPr>
+      <w:r>
+        <w:t>Designed APIs with focus on reliability, stability, and secure handling of financial transactions.</w:t>
+      </w:r>
+    </w:p>
+    <w:p>
+      <w:pPr>
+        <w:pStyle w:val="ListBullet"/>
+      </w:pPr>
+      <w:r>
+        <w:t>Adopted TDD and CI/CD practices to improve code quality and ensure consistent availability.</w:t>
       </w:r>
     </w:p>
     <w:p>
@@ -232,12 +250,12 @@
         <w:pStyle w:val="Heading3"/>
       </w:pPr>
       <w:r>
-        <w:t>Software Engineer – Fidelity Investments</w:t>
+        <w:t>Backend Software Engineer – VMware Carbon Black</w:t>
       </w:r>
     </w:p>
     <w:p>
       <w:r>
-        <w:t>Raleigh-Durham-Chapel Hill Area | Apr 2024 – Jun 2024</w:t>
+        <w:t>Remote | May 2022 – Apr 2024</w:t>
       </w:r>
     </w:p>
     <w:p>
@@ -245,7 +263,7 @@
         <w:pStyle w:val="ListBullet"/>
       </w:pPr>
       <w:r>
-        <w:t>Developed and integrated trading and cryptocurrency workflows for the Fidelity Digital Assets platform</w:t>
+        <w:t>Engineered a high-throughput data pipeline for the alert management system, designed to process 50k records per second and multi-billion records daily.</w:t>
       </w:r>
     </w:p>
     <w:p>
@@ -253,7 +271,7 @@
         <w:pStyle w:val="ListBullet"/>
       </w:pPr>
       <w:r>
-        <w:t>Aligned technology solutions with business objectives through collaboration with business partners and stakeholders</w:t>
+        <w:t>Optimized backend microservices in Golang and Java to ensure low-latency alerting and stable pipeline performance.</w:t>
       </w:r>
     </w:p>
     <w:p>
@@ -261,7 +279,7 @@
         <w:pStyle w:val="ListBullet"/>
       </w:pPr>
       <w:r>
-        <w:t>Promoted CI/CD practices to improve delivery speed and software quality</w:t>
+        <w:t>Enhanced reliability and scalability of event-driven pipelines using Kafka.</w:t>
       </w:r>
     </w:p>
     <w:p>
@@ -269,7 +287,20 @@
         <w:pStyle w:val="ListBullet"/>
       </w:pPr>
       <w:r>
-        <w:t>Mentored junior team members on technical implementation and engineering best practices</w:t>
+        <w:t>Fine-tuned system performance for large-scale security analytics workloads.</w:t>
+      </w:r>
+    </w:p>
+    <w:p>
+      <w:pPr>
+        <w:pStyle w:val="Heading3"/>
+      </w:pPr>
+      <w:r>
+        <w:t>Senior Consultant – Lincoln Financial Group</w:t>
+      </w:r>
+    </w:p>
+    <w:p>
+      <w:r>
+        <w:t>Remote | Dec 2019 – May 2022</w:t>
       </w:r>
     </w:p>
     <w:p>
@@ -277,20 +308,7 @@
         <w:pStyle w:val="ListBullet"/>
       </w:pPr>
       <w:r>
-        <w:t>Collaborated with cross-functional teams to deliver work efficiently and reliably</w:t>
-      </w:r>
-    </w:p>
-    <w:p>
-      <w:pPr>
-        <w:pStyle w:val="Heading3"/>
-      </w:pPr>
-      <w:r>
-        <w:t>Software Engineer – VMware Carbon Black</w:t>
-      </w:r>
-    </w:p>
-    <w:p>
-      <w:r>
-        <w:t>United States | May 2022 – Apr 2024</w:t>
+        <w:t>Migrated legacy monoliths to resilient microservices on AWS with high availability and failover designs.</w:t>
       </w:r>
     </w:p>
     <w:p>
@@ -298,7 +316,7 @@
         <w:pStyle w:val="ListBullet"/>
       </w:pPr>
       <w:r>
-        <w:t>Engineered scalable microservices architecture processing 500,000+ transactions daily, improving reliability by 25% and reducing latency by 15%</w:t>
+        <w:t>Implemented CI/CD pipelines and automated infra provisioning with Terraform to improve reliability.</w:t>
       </w:r>
     </w:p>
     <w:p>
@@ -306,108 +324,7 @@
         <w:pStyle w:val="ListBullet"/>
       </w:pPr>
       <w:r>
-        <w:t>Developed event processing and alerting pipelines handling high event throughput per second</w:t>
-      </w:r>
-    </w:p>
-    <w:p>
-      <w:pPr>
-        <w:pStyle w:val="ListBullet"/>
-      </w:pPr>
-      <w:r>
-        <w:t>Owned an alert data pipeline using gRPC, Protobuf, Kinesis, and OpenSearch</w:t>
-      </w:r>
-    </w:p>
-    <w:p>
-      <w:pPr>
-        <w:pStyle w:val="ListBullet"/>
-      </w:pPr>
-      <w:r>
-        <w:t>Built an event-driven email notification application in TypeScript for alerting and customer communication workflows</w:t>
-      </w:r>
-    </w:p>
-    <w:p>
-      <w:pPr>
-        <w:pStyle w:val="ListBullet"/>
-      </w:pPr>
-      <w:r>
-        <w:t>Collaborated with product, QA, and engineering teams to deliver security solutions</w:t>
-      </w:r>
-    </w:p>
-    <w:p>
-      <w:pPr>
-        <w:pStyle w:val="ListBullet"/>
-      </w:pPr>
-      <w:r>
-        <w:t>Applied continuous deployment practices in a production environment</w:t>
-      </w:r>
-    </w:p>
-    <w:p>
-      <w:pPr>
-        <w:pStyle w:val="Heading3"/>
-      </w:pPr>
-      <w:r>
-        <w:t>Software Engineer – Lincoln Financial Group</w:t>
-      </w:r>
-    </w:p>
-    <w:p>
-      <w:r>
-        <w:t>Greensboro | Dec 2019 – May 2022</w:t>
-      </w:r>
-    </w:p>
-    <w:p>
-      <w:pPr>
-        <w:pStyle w:val="ListBullet"/>
-      </w:pPr>
-      <w:r>
-        <w:t>Reengineered contact center applications into scalable microservices on AWS</w:t>
-      </w:r>
-    </w:p>
-    <w:p>
-      <w:pPr>
-        <w:pStyle w:val="ListBullet"/>
-      </w:pPr>
-      <w:r>
-        <w:t>Developed proof-of-concept solutions for Zuul routing, Spring Cloud Config, config bus, and streaming audio services</w:t>
-      </w:r>
-    </w:p>
-    <w:p>
-      <w:pPr>
-        <w:pStyle w:val="ListBullet"/>
-      </w:pPr>
-      <w:r>
-        <w:t>Built microservices using ECS, EC2, S3, DynamoDB, Lambda, and SQS</w:t>
-      </w:r>
-    </w:p>
-    <w:p>
-      <w:pPr>
-        <w:pStyle w:val="ListBullet"/>
-      </w:pPr>
-      <w:r>
-        <w:t>Developed Angular and TypeScript applications for configuration and administration workflows</w:t>
-      </w:r>
-    </w:p>
-    <w:p>
-      <w:pPr>
-        <w:pStyle w:val="ListBullet"/>
-      </w:pPr>
-      <w:r>
-        <w:t>Implemented Splunk dashboards to monitor application performance and support proactive issue resolution</w:t>
-      </w:r>
-    </w:p>
-    <w:p>
-      <w:pPr>
-        <w:pStyle w:val="ListBullet"/>
-      </w:pPr>
-      <w:r>
-        <w:t>Developed and maintained admin UI applications for configuration management</w:t>
-      </w:r>
-    </w:p>
-    <w:p>
-      <w:pPr>
-        <w:pStyle w:val="ListBullet"/>
-      </w:pPr>
-      <w:r>
-        <w:t>Conducted code reviews and mentored junior team members</w:t>
+        <w:t>Collaborated on API and data model design ensuring system stability and scalability.</w:t>
       </w:r>
     </w:p>
     <w:p>
@@ -420,7 +337,7 @@
     </w:p>
     <w:p>
       <w:r>
-        <w:t>Lowell, Arkansas Area | Mar 2018 – Dec 2019</w:t>
+        <w:t>Lowell, Arkansas | Mar 2018 – Dec 2019</w:t>
       </w:r>
     </w:p>
     <w:p>
@@ -428,7 +345,7 @@
         <w:pStyle w:val="ListBullet"/>
       </w:pPr>
       <w:r>
-        <w:t>Spearheaded development and maintenance of microservice applications for order management using Spring Boot, cloud infrastructure, and Spring Data JPA</w:t>
+        <w:t>Built resilient backend microservices with Spring Boot, supporting fault tolerance and scalability.</w:t>
       </w:r>
     </w:p>
     <w:p>
@@ -436,7 +353,7 @@
         <w:pStyle w:val="ListBullet"/>
       </w:pPr>
       <w:r>
-        <w:t>Supported order creation and tracking across intermodal, truck, ICS, and DCS business areas</w:t>
+        <w:t>Developed distributed order processing pipelines to maintain reliability under peak traffic.</w:t>
       </w:r>
     </w:p>
     <w:p>
@@ -444,7 +361,20 @@
         <w:pStyle w:val="ListBullet"/>
       </w:pPr>
       <w:r>
-        <w:t>Developed microservices using the Netflix OSS stack for specific use cases</w:t>
+        <w:t>Ensured service availability through automated deployments on AWS and Kubernetes.</w:t>
+      </w:r>
+    </w:p>
+    <w:p>
+      <w:pPr>
+        <w:pStyle w:val="Heading3"/>
+      </w:pPr>
+      <w:r>
+        <w:t>Earlier Roles – Syntel, Photon Infotech, LTI, IndigoTx Software Technologies</w:t>
+      </w:r>
+    </w:p>
+    <w:p>
+      <w:r>
+        <w:t>Multiple | 2010 – 2018</w:t>
       </w:r>
     </w:p>
     <w:p>
@@ -452,20 +382,7 @@
         <w:pStyle w:val="ListBullet"/>
       </w:pPr>
       <w:r>
-        <w:t>Provided mentorship and guidance to junior team members on complex projects and technologies</w:t>
-      </w:r>
-    </w:p>
-    <w:p>
-      <w:pPr>
-        <w:pStyle w:val="Heading3"/>
-      </w:pPr>
-      <w:r>
-        <w:t>Software Development Consultant – Syntel</w:t>
-      </w:r>
-    </w:p>
-    <w:p>
-      <w:r>
-        <w:t>Greater Atlanta Area | Oct 2016 – Feb 2018</w:t>
+        <w:t>Contributed to backend engineering and microservices design focusing on system availability and reliability.</w:t>
       </w:r>
     </w:p>
     <w:p>
@@ -473,7 +390,7 @@
         <w:pStyle w:val="ListBullet"/>
       </w:pPr>
       <w:r>
-        <w:t>Developed microservices for purchase order management using Spring Boot, Spring Cloud, distributed cache, and Java 8</w:t>
+        <w:t>Worked on distributed APIs, backend services, and cloud migration projects.</w:t>
       </w:r>
     </w:p>
     <w:p>
@@ -481,381 +398,53 @@
         <w:pStyle w:val="ListBullet"/>
       </w:pPr>
       <w:r>
-        <w:t>Designed and implemented UI dashboards for monitoring and processing applications using Angular and React.js</w:t>
+        <w:t>Mentored engineers and enforced practices for resilience, observability, and operational stability.</w:t>
       </w:r>
     </w:p>
     <w:p>
       <w:pPr>
-        <w:pStyle w:val="ListBullet"/>
+        <w:pStyle w:val="Heading2"/>
       </w:pPr>
       <w:r>
-        <w:t>Implemented microservices using the Netflix OSS stack (Eureka, Hystrix, Feign, Ribbon, Zuul)</w:t>
-      </w:r>
-    </w:p>
-    <w:p>
-      <w:pPr>
-        <w:pStyle w:val="ListBullet"/>
-      </w:pPr>
-      <w:r>
-        <w:t>Used Cloud Foundry (PCF) PaaS solutions for scalability and manageability</w:t>
-      </w:r>
-    </w:p>
-    <w:p>
-      <w:pPr>
-        <w:pStyle w:val="ListBullet"/>
-      </w:pPr>
-      <w:r>
-        <w:t>Developed Node.js applications integrated with MongoDB for specific functionalities</w:t>
-      </w:r>
-    </w:p>
-    <w:p>
-      <w:pPr>
-        <w:pStyle w:val="ListBullet"/>
-      </w:pPr>
-      <w:r>
-        <w:t>Applied pair programming and test-driven development (TDD) practices</w:t>
-      </w:r>
-    </w:p>
-    <w:p>
-      <w:pPr>
-        <w:pStyle w:val="Heading3"/>
-      </w:pPr>
-      <w:r>
-        <w:t>Senior Software Engineer – Photon</w:t>
+        <w:t>Projects</w:t>
       </w:r>
     </w:p>
     <w:p>
       <w:r>
-        <w:t>Greater Philadelphia Area | Oct 2015 – Oct 2016</w:t>
+        <w:rPr>
+          <w:b/>
+        </w:rPr>
+        <w:t>rag-pipeline-k8s</w:t>
       </w:r>
-    </w:p>
-    <w:p>
-      <w:pPr>
-        <w:pStyle w:val="ListBullet"/>
-      </w:pPr>
       <w:r>
-        <w:t>Led design and implementation of a responsive web application for Lincoln Financial Group</w:t>
+        <w:t xml:space="preserve"> (Jun 2026)</w:t>
       </w:r>
-    </w:p>
-    <w:p>
-      <w:pPr>
-        <w:pStyle w:val="ListBullet"/>
-      </w:pPr>
       <w:r>
-        <w:t>Developed RESTful APIs and AngularJS templates for integration with WebLogic Portal</w:t>
-      </w:r>
-    </w:p>
-    <w:p>
-      <w:pPr>
-        <w:pStyle w:val="ListBullet"/>
-      </w:pPr>
-      <w:r>
-        <w:t>Designed microservice applications with a focus on low coupling and high cohesion</w:t>
-      </w:r>
-    </w:p>
-    <w:p>
-      <w:pPr>
-        <w:pStyle w:val="ListBullet"/>
-      </w:pPr>
-      <w:r>
-        <w:t>Managed and mentored the team, providing guidance and support for skill development</w:t>
-      </w:r>
-    </w:p>
-    <w:p>
-      <w:pPr>
-        <w:pStyle w:val="ListBullet"/>
-      </w:pPr>
-      <w:r>
-        <w:t>Worked within Agile Scrum methodology with sprint planning and daily stand-ups</w:t>
-      </w:r>
-    </w:p>
-    <w:p>
-      <w:pPr>
-        <w:pStyle w:val="Heading3"/>
-      </w:pPr>
-      <w:r>
-        <w:t>Senior Software Engineer – Photon</w:t>
+        <w:t xml:space="preserve"> — End-to-end RAG pipeline on Kubernetes with KEDA autoscaled inference workloads</w:t>
       </w:r>
     </w:p>
     <w:p>
       <w:r>
-        <w:t>Dallas/Fort Worth Area | Dec 2014 – Oct 2015</w:t>
-      </w:r>
-    </w:p>
-    <w:p>
-      <w:pPr>
-        <w:pStyle w:val="ListBullet"/>
-      </w:pPr>
-      <w:r>
-        <w:t>Led end-to-end application development for JCPenney's responsive web presence</w:t>
-      </w:r>
-    </w:p>
-    <w:p>
-      <w:pPr>
-        <w:pStyle w:val="ListBullet"/>
-      </w:pPr>
-      <w:r>
-        <w:t>Analyzed service API gaps and developed REST wrappers to bridge integration issues</w:t>
-      </w:r>
-    </w:p>
-    <w:p>
-      <w:pPr>
-        <w:pStyle w:val="ListBullet"/>
-      </w:pPr>
-      <w:r>
-        <w:t>Developed Spring REST services for data exchange between application components</w:t>
-      </w:r>
-    </w:p>
-    <w:p>
-      <w:pPr>
-        <w:pStyle w:val="ListBullet"/>
-      </w:pPr>
-      <w:r>
-        <w:t>Improved mobile browsing experience with responsive web applications</w:t>
-      </w:r>
-    </w:p>
-    <w:p>
-      <w:pPr>
-        <w:pStyle w:val="ListBullet"/>
-      </w:pPr>
-      <w:r>
-        <w:t>Implemented business logic in the middle tier using Java classes and JavaBeans</w:t>
-      </w:r>
-    </w:p>
-    <w:p>
-      <w:pPr>
-        <w:pStyle w:val="ListBullet"/>
-      </w:pPr>
-      <w:r>
-        <w:t>Provided technical guidance and mentorship to team members</w:t>
-      </w:r>
-    </w:p>
-    <w:p>
-      <w:pPr>
-        <w:pStyle w:val="Heading3"/>
-      </w:pPr>
-      <w:r>
-        <w:t>Software Engineer – L&amp;T Infotech</w:t>
+        <w:t>https://github.com/saravanastar/rag-pipeline-k8s</w:t>
       </w:r>
     </w:p>
     <w:p>
       <w:r>
-        <w:t>Manappakkam, Chennai | Jan 2013 – Dec 2014</w:t>
+        <w:rPr>
+          <w:b/>
+        </w:rPr>
+        <w:t>keda-triton-autoscaling</w:t>
       </w:r>
-    </w:p>
-    <w:p>
-      <w:pPr>
-        <w:pStyle w:val="ListBullet"/>
-      </w:pPr>
       <w:r>
-        <w:t>Led end-to-end application development for Travelers Insurance</w:t>
+        <w:t xml:space="preserve"> (In Progress)</w:t>
       </w:r>
-    </w:p>
-    <w:p>
-      <w:pPr>
-        <w:pStyle w:val="ListBullet"/>
-      </w:pPr>
       <w:r>
-        <w:t>Developed an automated code generator to reduce manual coding effort</w:t>
-      </w:r>
-    </w:p>
-    <w:p>
-      <w:pPr>
-        <w:pStyle w:val="ListBullet"/>
-      </w:pPr>
-      <w:r>
-        <w:t>Designed front-end screens using Servlets, HTML, CSS, and JavaScript</w:t>
-      </w:r>
-    </w:p>
-    <w:p>
-      <w:pPr>
-        <w:pStyle w:val="ListBullet"/>
-      </w:pPr>
-      <w:r>
-        <w:t>Implemented business logic in the middle tier using Java classes and beans</w:t>
-      </w:r>
-    </w:p>
-    <w:p>
-      <w:pPr>
-        <w:pStyle w:val="ListBullet"/>
-      </w:pPr>
-      <w:r>
-        <w:t>Coordinated demonstrations to validate business requirements against application functionality</w:t>
-      </w:r>
-    </w:p>
-    <w:p>
-      <w:pPr>
-        <w:pStyle w:val="Heading3"/>
-      </w:pPr>
-      <w:r>
-        <w:t>Software Engineer – L&amp;T Infotech</w:t>
+        <w:t xml:space="preserve"> — GPU inference autoscaling with KEDA + Triton on Kubernetes</w:t>
       </w:r>
     </w:p>
     <w:p>
       <w:r>
-        <w:t>Chennai Area, India | Oct 2011 – Dec 2012</w:t>
-      </w:r>
-    </w:p>
-    <w:p>
-      <w:pPr>
-        <w:pStyle w:val="ListBullet"/>
-      </w:pPr>
-      <w:r>
-        <w:t>Developed an application from scratch for Great Eastern Life Insurance</w:t>
-      </w:r>
-    </w:p>
-    <w:p>
-      <w:pPr>
-        <w:pStyle w:val="ListBullet"/>
-      </w:pPr>
-      <w:r>
-        <w:t>Owned and maintained specific modules within the application</w:t>
-      </w:r>
-    </w:p>
-    <w:p>
-      <w:pPr>
-        <w:pStyle w:val="ListBullet"/>
-      </w:pPr>
-      <w:r>
-        <w:t>Used Spring Batch to implement pre-approved loyalty cards</w:t>
-      </w:r>
-    </w:p>
-    <w:p>
-      <w:pPr>
-        <w:pStyle w:val="ListBullet"/>
-      </w:pPr>
-      <w:r>
-        <w:t>Introduced jQuery pop-ups throughout the application to improve user experience</w:t>
-      </w:r>
-    </w:p>
-    <w:p>
-      <w:pPr>
-        <w:pStyle w:val="ListBullet"/>
-      </w:pPr>
-      <w:r>
-        <w:t>Addressed multi-browser compatibility issues across the portal</w:t>
-      </w:r>
-    </w:p>
-    <w:p>
-      <w:pPr>
-        <w:pStyle w:val="ListBullet"/>
-      </w:pPr>
-      <w:r>
-        <w:t>Developed Health Tip feature and implemented audit trails for user actions</w:t>
-      </w:r>
-    </w:p>
-    <w:p>
-      <w:pPr>
-        <w:pStyle w:val="ListBullet"/>
-      </w:pPr>
-      <w:r>
-        <w:t>Designed database schemas and maintained scripts for optimal performance</w:t>
-      </w:r>
-    </w:p>
-    <w:p>
-      <w:pPr>
-        <w:pStyle w:val="ListBullet"/>
-      </w:pPr>
-      <w:r>
-        <w:t>Supported local QA build processes and managed continuous integration</w:t>
-      </w:r>
-    </w:p>
-    <w:p>
-      <w:pPr>
-        <w:pStyle w:val="Heading3"/>
-      </w:pPr>
-      <w:r>
-        <w:t>Software Developer – IndigoTx Software Technologies</w:t>
-      </w:r>
-    </w:p>
-    <w:p>
-      <w:r>
-        <w:t>Chennai Area, India | Apr 2010 – Sep 2011</w:t>
-      </w:r>
-    </w:p>
-    <w:p>
-      <w:pPr>
-        <w:pStyle w:val="ListBullet"/>
-      </w:pPr>
-      <w:r>
-        <w:t>Owned end-to-end application development encompassing backend services and frontend interfaces</w:t>
-      </w:r>
-    </w:p>
-    <w:p>
-      <w:pPr>
-        <w:pStyle w:val="ListBullet"/>
-      </w:pPr>
-      <w:r>
-        <w:t>Designed, coded, and debugged stock broker applications using multiple programming languages</w:t>
-      </w:r>
-    </w:p>
-    <w:p>
-      <w:pPr>
-        <w:pStyle w:val="ListBullet"/>
-      </w:pPr>
-      <w:r>
-        <w:t>Transformed wireframes into HTML web pages ensuring accurate design representation</w:t>
-      </w:r>
-    </w:p>
-    <w:p>
-      <w:pPr>
-        <w:pStyle w:val="ListBullet"/>
-      </w:pPr>
-      <w:r>
-        <w:t>Evaluated new technologies and conducted proof of concepts for implementation</w:t>
-      </w:r>
-    </w:p>
-    <w:p>
-      <w:pPr>
-        <w:pStyle w:val="ListBullet"/>
-      </w:pPr>
-      <w:r>
-        <w:t>Maintained compliance standards across development processes</w:t>
-      </w:r>
-    </w:p>
-    <w:p>
-      <w:pPr>
-        <w:pStyle w:val="ListBullet"/>
-      </w:pPr>
-      <w:r>
-        <w:t>Customized products to meet unique client requirements</w:t>
-      </w:r>
-    </w:p>
-    <w:p>
-      <w:pPr>
-        <w:pStyle w:val="ListBullet"/>
-      </w:pPr>
-      <w:r>
-        <w:t>Designed and documented RESTful APIs with cross-functional teams</w:t>
-      </w:r>
-    </w:p>
-    <w:p>
-      <w:pPr>
-        <w:pStyle w:val="ListBullet"/>
-      </w:pPr>
-      <w:r>
-        <w:t>Oversaw quality assurance and testing processes</w:t>
-      </w:r>
-    </w:p>
-    <w:p>
-      <w:pPr>
-        <w:pStyle w:val="Heading3"/>
-      </w:pPr>
-      <w:r>
-        <w:t>Technical Analyst – Sutherland Global Services</w:t>
-      </w:r>
-    </w:p>
-    <w:p>
-      <w:r>
-        <w:t>India | Nov 2009 – Mar 2010</w:t>
-      </w:r>
-    </w:p>
-    <w:p>
-      <w:pPr>
-        <w:pStyle w:val="ListBullet"/>
-      </w:pPr>
-      <w:r>
-        <w:t>Worked as Technical Analyst in non-voice process</w:t>
+        <w:t>https://github.com/saravanastar/llm-inference-k8s</w:t>
       </w:r>
     </w:p>
     <w:p>
@@ -868,10 +457,18 @@
     </w:p>
     <w:p>
       <w:r>
-        <w:t>Bachelor of Engineering – Computer Science, Anna University</w:t>
+        <w:t>Bachelor's Degree – Computer Science, Sudharsan Engineering College, 2005 - 2009</w:t>
       </w:r>
     </w:p>
     <w:p>
+      <w:r>
+        <w:t>Nano Degree – Machine Learning, Udacity, 2019</w:t>
+      </w:r>
+    </w:p>
+    <w:p>
+      <w:pPr>
+        <w:pStyle w:val="ListBullet"/>
+      </w:pPr>
       <w:r>
         <w:t>AWS Certified Solutions Architect – Associate</w:t>
       </w:r>

</xml_diff>